<commit_message>
PDF→Word 컬럼 boundary chunk 강제 분리 + 표 너비 큰 경우 landscape 자동
</commit_message>
<xml_diff>
--- a/test/out_accuracy/1_simple_converted.docx
+++ b/test/out_accuracy/1_simple_converted.docx
@@ -4,7 +4,7 @@
   <w:body>
     <w:tbl>
       <w:tblPr>
-        <w:tblW w:type="pct" w:w="100%"/>
+        <w:tblW w:type="dxa" w:w="3650"/>
         <w:tblBorders>
           <w:top w:val="single" w:color="888888" w:sz="4"/>
           <w:left w:val="single" w:color="888888" w:sz="4"/>
@@ -15,22 +15,31 @@
         </w:tblBorders>
       </w:tblPr>
       <w:tblGrid>
-        <w:gridCol w:w="1915"/>
-        <w:gridCol w:w="1915"/>
-        <w:gridCol w:w="2394"/>
-        <w:gridCol w:w="2802"/>
+        <w:gridCol w:w="1190"/>
+        <w:gridCol w:w="800"/>
+        <w:gridCol w:w="860"/>
+        <w:gridCol w:w="800"/>
       </w:tblGrid>
       <w:tr>
         <w:tc>
           <w:tcPr>
-            <w:tcW w:type="dxa" w:w="1915"/>
-          </w:tcPr>
-          <w:p>
-            <w:r>
-              <w:rPr>
-                <w:color w:val="000000"/>
-                <w:sz w:val="20"/>
-                <w:szCs w:val="20"/>
+            <w:tcW w:type="dxa" w:w="1190"/>
+            <w:tcMar>
+              <w:top w:type="dxa" w:w="50"/>
+              <w:left w:type="dxa" w:w="80"/>
+              <w:bottom w:type="dxa" w:w="50"/>
+              <w:right w:type="dxa" w:w="80"/>
+            </w:tcMar>
+          </w:tcPr>
+          <w:p>
+            <w:pPr>
+              <w:spacing w:after="0" w:before="0"/>
+            </w:pPr>
+            <w:r>
+              <w:rPr>
+                <w:color w:val="000000"/>
+                <w:sz w:val="18"/>
+                <w:szCs w:val="18"/>
               </w:rPr>
               <w:t xml:space="preserve">항목 수량</w:t>
             </w:r>
@@ -38,14 +47,23 @@
         </w:tc>
         <w:tc>
           <w:tcPr>
-            <w:tcW w:type="dxa" w:w="1915"/>
-          </w:tcPr>
-          <w:p>
-            <w:r>
-              <w:rPr>
-                <w:color w:val="000000"/>
-                <w:sz w:val="20"/>
-                <w:szCs w:val="20"/>
+            <w:tcW w:type="dxa" w:w="800"/>
+            <w:tcMar>
+              <w:top w:type="dxa" w:w="50"/>
+              <w:left w:type="dxa" w:w="80"/>
+              <w:bottom w:type="dxa" w:w="50"/>
+              <w:right w:type="dxa" w:w="80"/>
+            </w:tcMar>
+          </w:tcPr>
+          <w:p>
+            <w:pPr>
+              <w:spacing w:after="0" w:before="0"/>
+            </w:pPr>
+            <w:r>
+              <w:rPr>
+                <w:color w:val="000000"/>
+                <w:sz w:val="18"/>
+                <w:szCs w:val="18"/>
               </w:rPr>
               <w:t xml:space="preserve">단가</w:t>
             </w:r>
@@ -53,14 +71,23 @@
         </w:tc>
         <w:tc>
           <w:tcPr>
-            <w:tcW w:type="dxa" w:w="2394"/>
-          </w:tcPr>
-          <w:p>
-            <w:r>
-              <w:rPr>
-                <w:color w:val="000000"/>
-                <w:sz w:val="20"/>
-                <w:szCs w:val="20"/>
+            <w:tcW w:type="dxa" w:w="860"/>
+            <w:tcMar>
+              <w:top w:type="dxa" w:w="50"/>
+              <w:left w:type="dxa" w:w="80"/>
+              <w:bottom w:type="dxa" w:w="50"/>
+              <w:right w:type="dxa" w:w="80"/>
+            </w:tcMar>
+          </w:tcPr>
+          <w:p>
+            <w:pPr>
+              <w:spacing w:after="0" w:before="0"/>
+            </w:pPr>
+            <w:r>
+              <w:rPr>
+                <w:color w:val="000000"/>
+                <w:sz w:val="18"/>
+                <w:szCs w:val="18"/>
               </w:rPr>
               <w:t xml:space="preserve">합계</w:t>
             </w:r>
@@ -68,14 +95,23 @@
         </w:tc>
         <w:tc>
           <w:tcPr>
-            <w:tcW w:type="dxa" w:w="2802"/>
-          </w:tcPr>
-          <w:p>
-            <w:r>
-              <w:rPr>
-                <w:color w:val="000000"/>
-                <w:sz w:val="20"/>
-                <w:szCs w:val="20"/>
+            <w:tcW w:type="dxa" w:w="800"/>
+            <w:tcMar>
+              <w:top w:type="dxa" w:w="50"/>
+              <w:left w:type="dxa" w:w="80"/>
+              <w:bottom w:type="dxa" w:w="50"/>
+              <w:right w:type="dxa" w:w="80"/>
+            </w:tcMar>
+          </w:tcPr>
+          <w:p>
+            <w:pPr>
+              <w:spacing w:after="0" w:before="0"/>
+            </w:pPr>
+            <w:r>
+              <w:rPr>
+                <w:color w:val="000000"/>
+                <w:sz w:val="18"/>
+                <w:szCs w:val="18"/>
               </w:rPr>
               <w:t xml:space="preserve"/>
             </w:r>
@@ -85,14 +121,23 @@
       <w:tr>
         <w:tc>
           <w:tcPr>
-            <w:tcW w:type="dxa" w:w="1915"/>
-          </w:tcPr>
-          <w:p>
-            <w:r>
-              <w:rPr>
-                <w:color w:val="000000"/>
-                <w:sz w:val="20"/>
-                <w:szCs w:val="20"/>
+            <w:tcW w:type="dxa" w:w="1190"/>
+            <w:tcMar>
+              <w:top w:type="dxa" w:w="50"/>
+              <w:left w:type="dxa" w:w="80"/>
+              <w:bottom w:type="dxa" w:w="50"/>
+              <w:right w:type="dxa" w:w="80"/>
+            </w:tcMar>
+          </w:tcPr>
+          <w:p>
+            <w:pPr>
+              <w:spacing w:after="0" w:before="0"/>
+            </w:pPr>
+            <w:r>
+              <w:rPr>
+                <w:color w:val="000000"/>
+                <w:sz w:val="18"/>
+                <w:szCs w:val="18"/>
               </w:rPr>
               <w:t xml:space="preserve">연필 10</w:t>
             </w:r>
@@ -100,14 +145,23 @@
         </w:tc>
         <w:tc>
           <w:tcPr>
-            <w:tcW w:type="dxa" w:w="1915"/>
-          </w:tcPr>
-          <w:p>
-            <w:r>
-              <w:rPr>
-                <w:color w:val="000000"/>
-                <w:sz w:val="20"/>
-                <w:szCs w:val="20"/>
+            <w:tcW w:type="dxa" w:w="800"/>
+            <w:tcMar>
+              <w:top w:type="dxa" w:w="50"/>
+              <w:left w:type="dxa" w:w="80"/>
+              <w:bottom w:type="dxa" w:w="50"/>
+              <w:right w:type="dxa" w:w="80"/>
+            </w:tcMar>
+          </w:tcPr>
+          <w:p>
+            <w:pPr>
+              <w:spacing w:after="0" w:before="0"/>
+            </w:pPr>
+            <w:r>
+              <w:rPr>
+                <w:color w:val="000000"/>
+                <w:sz w:val="18"/>
+                <w:szCs w:val="18"/>
               </w:rPr>
               <w:t xml:space="preserve">500</w:t>
             </w:r>
@@ -115,14 +169,23 @@
         </w:tc>
         <w:tc>
           <w:tcPr>
-            <w:tcW w:type="dxa" w:w="2394"/>
-          </w:tcPr>
-          <w:p>
-            <w:r>
-              <w:rPr>
-                <w:color w:val="000000"/>
-                <w:sz w:val="20"/>
-                <w:szCs w:val="20"/>
+            <w:tcW w:type="dxa" w:w="860"/>
+            <w:tcMar>
+              <w:top w:type="dxa" w:w="50"/>
+              <w:left w:type="dxa" w:w="80"/>
+              <w:bottom w:type="dxa" w:w="50"/>
+              <w:right w:type="dxa" w:w="80"/>
+            </w:tcMar>
+          </w:tcPr>
+          <w:p>
+            <w:pPr>
+              <w:spacing w:after="0" w:before="0"/>
+            </w:pPr>
+            <w:r>
+              <w:rPr>
+                <w:color w:val="000000"/>
+                <w:sz w:val="18"/>
+                <w:szCs w:val="18"/>
               </w:rPr>
               <w:t xml:space="preserve">5,000</w:t>
             </w:r>
@@ -130,14 +193,23 @@
         </w:tc>
         <w:tc>
           <w:tcPr>
-            <w:tcW w:type="dxa" w:w="2802"/>
-          </w:tcPr>
-          <w:p>
-            <w:r>
-              <w:rPr>
-                <w:color w:val="000000"/>
-                <w:sz w:val="20"/>
-                <w:szCs w:val="20"/>
+            <w:tcW w:type="dxa" w:w="800"/>
+            <w:tcMar>
+              <w:top w:type="dxa" w:w="50"/>
+              <w:left w:type="dxa" w:w="80"/>
+              <w:bottom w:type="dxa" w:w="50"/>
+              <w:right w:type="dxa" w:w="80"/>
+            </w:tcMar>
+          </w:tcPr>
+          <w:p>
+            <w:pPr>
+              <w:spacing w:after="0" w:before="0"/>
+            </w:pPr>
+            <w:r>
+              <w:rPr>
+                <w:color w:val="000000"/>
+                <w:sz w:val="18"/>
+                <w:szCs w:val="18"/>
               </w:rPr>
               <w:t xml:space="preserve"/>
             </w:r>
@@ -147,14 +219,23 @@
       <w:tr>
         <w:tc>
           <w:tcPr>
-            <w:tcW w:type="dxa" w:w="1915"/>
-          </w:tcPr>
-          <w:p>
-            <w:r>
-              <w:rPr>
-                <w:color w:val="000000"/>
-                <w:sz w:val="20"/>
-                <w:szCs w:val="20"/>
+            <w:tcW w:type="dxa" w:w="1190"/>
+            <w:tcMar>
+              <w:top w:type="dxa" w:w="50"/>
+              <w:left w:type="dxa" w:w="80"/>
+              <w:bottom w:type="dxa" w:w="50"/>
+              <w:right w:type="dxa" w:w="80"/>
+            </w:tcMar>
+          </w:tcPr>
+          <w:p>
+            <w:pPr>
+              <w:spacing w:after="0" w:before="0"/>
+            </w:pPr>
+            <w:r>
+              <w:rPr>
+                <w:color w:val="000000"/>
+                <w:sz w:val="18"/>
+                <w:szCs w:val="18"/>
               </w:rPr>
               <w:t xml:space="preserve">지우개 5</w:t>
             </w:r>
@@ -162,14 +243,23 @@
         </w:tc>
         <w:tc>
           <w:tcPr>
-            <w:tcW w:type="dxa" w:w="1915"/>
-          </w:tcPr>
-          <w:p>
-            <w:r>
-              <w:rPr>
-                <w:color w:val="000000"/>
-                <w:sz w:val="20"/>
-                <w:szCs w:val="20"/>
+            <w:tcW w:type="dxa" w:w="800"/>
+            <w:tcMar>
+              <w:top w:type="dxa" w:w="50"/>
+              <w:left w:type="dxa" w:w="80"/>
+              <w:bottom w:type="dxa" w:w="50"/>
+              <w:right w:type="dxa" w:w="80"/>
+            </w:tcMar>
+          </w:tcPr>
+          <w:p>
+            <w:pPr>
+              <w:spacing w:after="0" w:before="0"/>
+            </w:pPr>
+            <w:r>
+              <w:rPr>
+                <w:color w:val="000000"/>
+                <w:sz w:val="18"/>
+                <w:szCs w:val="18"/>
               </w:rPr>
               <w:t xml:space="preserve">1,000</w:t>
             </w:r>
@@ -177,14 +267,23 @@
         </w:tc>
         <w:tc>
           <w:tcPr>
-            <w:tcW w:type="dxa" w:w="2394"/>
-          </w:tcPr>
-          <w:p>
-            <w:r>
-              <w:rPr>
-                <w:color w:val="000000"/>
-                <w:sz w:val="20"/>
-                <w:szCs w:val="20"/>
+            <w:tcW w:type="dxa" w:w="860"/>
+            <w:tcMar>
+              <w:top w:type="dxa" w:w="50"/>
+              <w:left w:type="dxa" w:w="80"/>
+              <w:bottom w:type="dxa" w:w="50"/>
+              <w:right w:type="dxa" w:w="80"/>
+            </w:tcMar>
+          </w:tcPr>
+          <w:p>
+            <w:pPr>
+              <w:spacing w:after="0" w:before="0"/>
+            </w:pPr>
+            <w:r>
+              <w:rPr>
+                <w:color w:val="000000"/>
+                <w:sz w:val="18"/>
+                <w:szCs w:val="18"/>
               </w:rPr>
               <w:t xml:space="preserve">5,000</w:t>
             </w:r>
@@ -192,14 +291,23 @@
         </w:tc>
         <w:tc>
           <w:tcPr>
-            <w:tcW w:type="dxa" w:w="2802"/>
-          </w:tcPr>
-          <w:p>
-            <w:r>
-              <w:rPr>
-                <w:color w:val="000000"/>
-                <w:sz w:val="20"/>
-                <w:szCs w:val="20"/>
+            <w:tcW w:type="dxa" w:w="800"/>
+            <w:tcMar>
+              <w:top w:type="dxa" w:w="50"/>
+              <w:left w:type="dxa" w:w="80"/>
+              <w:bottom w:type="dxa" w:w="50"/>
+              <w:right w:type="dxa" w:w="80"/>
+            </w:tcMar>
+          </w:tcPr>
+          <w:p>
+            <w:pPr>
+              <w:spacing w:after="0" w:before="0"/>
+            </w:pPr>
+            <w:r>
+              <w:rPr>
+                <w:color w:val="000000"/>
+                <w:sz w:val="18"/>
+                <w:szCs w:val="18"/>
               </w:rPr>
               <w:t xml:space="preserve"/>
             </w:r>
@@ -209,14 +317,23 @@
       <w:tr>
         <w:tc>
           <w:tcPr>
-            <w:tcW w:type="dxa" w:w="1915"/>
-          </w:tcPr>
-          <w:p>
-            <w:r>
-              <w:rPr>
-                <w:color w:val="000000"/>
-                <w:sz w:val="20"/>
-                <w:szCs w:val="20"/>
+            <w:tcW w:type="dxa" w:w="1190"/>
+            <w:tcMar>
+              <w:top w:type="dxa" w:w="50"/>
+              <w:left w:type="dxa" w:w="80"/>
+              <w:bottom w:type="dxa" w:w="50"/>
+              <w:right w:type="dxa" w:w="80"/>
+            </w:tcMar>
+          </w:tcPr>
+          <w:p>
+            <w:pPr>
+              <w:spacing w:after="0" w:before="0"/>
+            </w:pPr>
+            <w:r>
+              <w:rPr>
+                <w:color w:val="000000"/>
+                <w:sz w:val="18"/>
+                <w:szCs w:val="18"/>
               </w:rPr>
               <w:t xml:space="preserve">공책 3</w:t>
             </w:r>
@@ -224,14 +341,23 @@
         </w:tc>
         <w:tc>
           <w:tcPr>
-            <w:tcW w:type="dxa" w:w="1915"/>
-          </w:tcPr>
-          <w:p>
-            <w:r>
-              <w:rPr>
-                <w:color w:val="000000"/>
-                <w:sz w:val="20"/>
-                <w:szCs w:val="20"/>
+            <w:tcW w:type="dxa" w:w="800"/>
+            <w:tcMar>
+              <w:top w:type="dxa" w:w="50"/>
+              <w:left w:type="dxa" w:w="80"/>
+              <w:bottom w:type="dxa" w:w="50"/>
+              <w:right w:type="dxa" w:w="80"/>
+            </w:tcMar>
+          </w:tcPr>
+          <w:p>
+            <w:pPr>
+              <w:spacing w:after="0" w:before="0"/>
+            </w:pPr>
+            <w:r>
+              <w:rPr>
+                <w:color w:val="000000"/>
+                <w:sz w:val="18"/>
+                <w:szCs w:val="18"/>
               </w:rPr>
               <w:t xml:space="preserve">2,500</w:t>
             </w:r>
@@ -239,14 +365,23 @@
         </w:tc>
         <w:tc>
           <w:tcPr>
-            <w:tcW w:type="dxa" w:w="2394"/>
-          </w:tcPr>
-          <w:p>
-            <w:r>
-              <w:rPr>
-                <w:color w:val="000000"/>
-                <w:sz w:val="20"/>
-                <w:szCs w:val="20"/>
+            <w:tcW w:type="dxa" w:w="860"/>
+            <w:tcMar>
+              <w:top w:type="dxa" w:w="50"/>
+              <w:left w:type="dxa" w:w="80"/>
+              <w:bottom w:type="dxa" w:w="50"/>
+              <w:right w:type="dxa" w:w="80"/>
+            </w:tcMar>
+          </w:tcPr>
+          <w:p>
+            <w:pPr>
+              <w:spacing w:after="0" w:before="0"/>
+            </w:pPr>
+            <w:r>
+              <w:rPr>
+                <w:color w:val="000000"/>
+                <w:sz w:val="18"/>
+                <w:szCs w:val="18"/>
               </w:rPr>
               <w:t xml:space="preserve">7,500</w:t>
             </w:r>
@@ -254,14 +389,23 @@
         </w:tc>
         <w:tc>
           <w:tcPr>
-            <w:tcW w:type="dxa" w:w="2802"/>
-          </w:tcPr>
-          <w:p>
-            <w:r>
-              <w:rPr>
-                <w:color w:val="000000"/>
-                <w:sz w:val="20"/>
-                <w:szCs w:val="20"/>
+            <w:tcW w:type="dxa" w:w="800"/>
+            <w:tcMar>
+              <w:top w:type="dxa" w:w="50"/>
+              <w:left w:type="dxa" w:w="80"/>
+              <w:bottom w:type="dxa" w:w="50"/>
+              <w:right w:type="dxa" w:w="80"/>
+            </w:tcMar>
+          </w:tcPr>
+          <w:p>
+            <w:pPr>
+              <w:spacing w:after="0" w:before="0"/>
+            </w:pPr>
+            <w:r>
+              <w:rPr>
+                <w:color w:val="000000"/>
+                <w:sz w:val="18"/>
+                <w:szCs w:val="18"/>
               </w:rPr>
               <w:t xml:space="preserve"/>
             </w:r>
@@ -271,14 +415,23 @@
       <w:tr>
         <w:tc>
           <w:tcPr>
-            <w:tcW w:type="dxa" w:w="1915"/>
-          </w:tcPr>
-          <w:p>
-            <w:r>
-              <w:rPr>
-                <w:color w:val="000000"/>
-                <w:sz w:val="20"/>
-                <w:szCs w:val="20"/>
+            <w:tcW w:type="dxa" w:w="1190"/>
+            <w:tcMar>
+              <w:top w:type="dxa" w:w="50"/>
+              <w:left w:type="dxa" w:w="80"/>
+              <w:bottom w:type="dxa" w:w="50"/>
+              <w:right w:type="dxa" w:w="80"/>
+            </w:tcMar>
+          </w:tcPr>
+          <w:p>
+            <w:pPr>
+              <w:spacing w:after="0" w:before="0"/>
+            </w:pPr>
+            <w:r>
+              <w:rPr>
+                <w:color w:val="000000"/>
+                <w:sz w:val="18"/>
+                <w:szCs w:val="18"/>
               </w:rPr>
               <w:t xml:space="preserve">합계</w:t>
             </w:r>
@@ -286,14 +439,23 @@
         </w:tc>
         <w:tc>
           <w:tcPr>
-            <w:tcW w:type="dxa" w:w="1915"/>
-          </w:tcPr>
-          <w:p>
-            <w:r>
-              <w:rPr>
-                <w:color w:val="000000"/>
-                <w:sz w:val="20"/>
-                <w:szCs w:val="20"/>
+            <w:tcW w:type="dxa" w:w="800"/>
+            <w:tcMar>
+              <w:top w:type="dxa" w:w="50"/>
+              <w:left w:type="dxa" w:w="80"/>
+              <w:bottom w:type="dxa" w:w="50"/>
+              <w:right w:type="dxa" w:w="80"/>
+            </w:tcMar>
+          </w:tcPr>
+          <w:p>
+            <w:pPr>
+              <w:spacing w:after="0" w:before="0"/>
+            </w:pPr>
+            <w:r>
+              <w:rPr>
+                <w:color w:val="000000"/>
+                <w:sz w:val="18"/>
+                <w:szCs w:val="18"/>
               </w:rPr>
               <w:t xml:space="preserve"/>
             </w:r>
@@ -301,14 +463,23 @@
         </w:tc>
         <w:tc>
           <w:tcPr>
-            <w:tcW w:type="dxa" w:w="2394"/>
-          </w:tcPr>
-          <w:p>
-            <w:r>
-              <w:rPr>
-                <w:color w:val="000000"/>
-                <w:sz w:val="20"/>
-                <w:szCs w:val="20"/>
+            <w:tcW w:type="dxa" w:w="860"/>
+            <w:tcMar>
+              <w:top w:type="dxa" w:w="50"/>
+              <w:left w:type="dxa" w:w="80"/>
+              <w:bottom w:type="dxa" w:w="50"/>
+              <w:right w:type="dxa" w:w="80"/>
+            </w:tcMar>
+          </w:tcPr>
+          <w:p>
+            <w:pPr>
+              <w:spacing w:after="0" w:before="0"/>
+            </w:pPr>
+            <w:r>
+              <w:rPr>
+                <w:color w:val="000000"/>
+                <w:sz w:val="18"/>
+                <w:szCs w:val="18"/>
               </w:rPr>
               <w:t xml:space="preserve">17,500</w:t>
             </w:r>
@@ -316,14 +487,23 @@
         </w:tc>
         <w:tc>
           <w:tcPr>
-            <w:tcW w:type="dxa" w:w="2802"/>
-          </w:tcPr>
-          <w:p>
-            <w:r>
-              <w:rPr>
-                <w:color w:val="000000"/>
-                <w:sz w:val="20"/>
-                <w:szCs w:val="20"/>
+            <w:tcW w:type="dxa" w:w="800"/>
+            <w:tcMar>
+              <w:top w:type="dxa" w:w="50"/>
+              <w:left w:type="dxa" w:w="80"/>
+              <w:bottom w:type="dxa" w:w="50"/>
+              <w:right w:type="dxa" w:w="80"/>
+            </w:tcMar>
+          </w:tcPr>
+          <w:p>
+            <w:pPr>
+              <w:spacing w:after="0" w:before="0"/>
+            </w:pPr>
+            <w:r>
+              <w:rPr>
+                <w:color w:val="000000"/>
+                <w:sz w:val="18"/>
+                <w:szCs w:val="18"/>
               </w:rPr>
               <w:t xml:space="preserve"/>
             </w:r>

</xml_diff>